<commit_message>
Update documentation and script imports
- Updated GUIDE_3_MD_Execution.docx and GUIDE_3_MD_Execution.pdf files to reflect recent changes.
- Modified the import statement in run_clustering_silvia_revised.py to reference the correct module 'clustering_silvia_revised'.
</commit_message>
<xml_diff>
--- a/05_literature/my_protocols/GUIDE_3_MD_Execution.docx
+++ b/05_literature/my_protocols/GUIDE_3_MD_Execution.docx
@@ -18,18 +18,7 @@
           <w:sz w:val="14"/>
           <w:szCs w:val="14"/>
         </w:rPr>
-        <w:t xml:space="preserve">GUIDE </w:t>
-      </w:r>
-      <w:r>
-        <w:rPr>
-          <w:rFonts w:eastAsia="Arial" w:cs="Arial"/>
-          <w:b/>
-          <w:bCs/>
-          <w:color w:val="888888"/>
-          <w:sz w:val="14"/>
-          <w:szCs w:val="14"/>
-        </w:rPr>
-        <w:t>3</w:t>
+        <w:t>GUIDE 3</w:t>
       </w:r>
     </w:p>
     <w:p>
@@ -868,7 +857,7 @@
         <w:pStyle w:val="ListParagraph"/>
         <w:numPr>
           <w:ilvl w:val="0"/>
-          <w:numId w:val="3"/>
+          <w:numId w:val="4"/>
         </w:numPr>
         <w:spacing w:before="60" w:after="60"/>
         <w:jc w:val="both"/>
@@ -888,7 +877,7 @@
         <w:pStyle w:val="ListParagraph"/>
         <w:numPr>
           <w:ilvl w:val="0"/>
-          <w:numId w:val="1"/>
+          <w:numId w:val="5"/>
         </w:numPr>
         <w:spacing w:before="60" w:after="60"/>
         <w:jc w:val="both"/>
@@ -908,7 +897,7 @@
         <w:pStyle w:val="ListParagraph"/>
         <w:numPr>
           <w:ilvl w:val="0"/>
-          <w:numId w:val="1"/>
+          <w:numId w:val="6"/>
         </w:numPr>
         <w:spacing w:before="60" w:after="60"/>
         <w:jc w:val="both"/>
@@ -957,231 +946,8 @@
           <w:sz w:val="24"/>
           <w:szCs w:val="24"/>
         </w:rPr>
-        <w:t>3.2. Run First Production Segment</w:t>
-      </w:r>
-    </w:p>
-    <w:p>
-      <w:pPr>
-        <w:pStyle w:val="Normal"/>
-        <w:shd w:val="clear" w:fill="F4F4F4"/>
-        <w:spacing w:before="60" w:after="60"/>
-        <w:ind w:left="720" w:hanging="0"/>
-        <w:jc w:val="both"/>
-        <w:rPr/>
-      </w:pPr>
-      <w:r>
-        <w:rPr>
-          <w:rFonts w:eastAsia="Courier New" w:cs="Courier New" w:ascii="Courier New" w:hAnsi="Courier New"/>
-          <w:color w:val="333333"/>
-          <w:sz w:val="18"/>
-          <w:szCs w:val="18"/>
-        </w:rPr>
-        <w:t>python -u openmm_run.py \</w:t>
-      </w:r>
-    </w:p>
-    <w:p>
-      <w:pPr>
-        <w:pStyle w:val="Normal"/>
-        <w:shd w:val="clear" w:fill="F4F4F4"/>
-        <w:spacing w:before="60" w:after="60"/>
-        <w:ind w:left="720" w:hanging="0"/>
-        <w:jc w:val="both"/>
-        <w:rPr/>
-      </w:pPr>
-      <w:r>
-        <w:rPr>
-          <w:rFonts w:eastAsia="Courier New" w:cs="Courier New" w:ascii="Courier New" w:hAnsi="Courier New"/>
-          <w:color w:val="333333"/>
-          <w:sz w:val="18"/>
-          <w:szCs w:val="18"/>
-        </w:rPr>
-        <w:t xml:space="preserve">  </w:t>
-      </w:r>
-      <w:r>
-        <w:rPr>
-          <w:rFonts w:eastAsia="Courier New" w:cs="Courier New" w:ascii="Courier New" w:hAnsi="Courier New"/>
-          <w:color w:val="333333"/>
-          <w:sz w:val="18"/>
-          <w:szCs w:val="18"/>
-        </w:rPr>
-        <w:t>-i step7_production.inp \</w:t>
-      </w:r>
-    </w:p>
-    <w:p>
-      <w:pPr>
-        <w:pStyle w:val="Normal"/>
-        <w:shd w:val="clear" w:fill="F4F4F4"/>
-        <w:spacing w:before="60" w:after="60"/>
-        <w:ind w:left="720" w:hanging="0"/>
-        <w:jc w:val="both"/>
-        <w:rPr/>
-      </w:pPr>
-      <w:r>
-        <w:rPr>
-          <w:rFonts w:eastAsia="Courier New" w:cs="Courier New" w:ascii="Courier New" w:hAnsi="Courier New"/>
-          <w:color w:val="333333"/>
-          <w:sz w:val="18"/>
-          <w:szCs w:val="18"/>
-        </w:rPr>
-        <w:t xml:space="preserve">  </w:t>
-      </w:r>
-      <w:r>
-        <w:rPr>
-          <w:rFonts w:eastAsia="Courier New" w:cs="Courier New" w:ascii="Courier New" w:hAnsi="Courier New"/>
-          <w:color w:val="333333"/>
-          <w:sz w:val="18"/>
-          <w:szCs w:val="18"/>
-        </w:rPr>
-        <w:t>-t toppar.str \</w:t>
-      </w:r>
-    </w:p>
-    <w:p>
-      <w:pPr>
-        <w:pStyle w:val="Normal"/>
-        <w:shd w:val="clear" w:fill="F4F4F4"/>
-        <w:spacing w:before="60" w:after="60"/>
-        <w:ind w:left="720" w:hanging="0"/>
-        <w:jc w:val="both"/>
-        <w:rPr/>
-      </w:pPr>
-      <w:r>
-        <w:rPr>
-          <w:rFonts w:eastAsia="Courier New" w:cs="Courier New" w:ascii="Courier New" w:hAnsi="Courier New"/>
-          <w:color w:val="333333"/>
-          <w:sz w:val="18"/>
-          <w:szCs w:val="18"/>
-        </w:rPr>
-        <w:t xml:space="preserve">  </w:t>
-      </w:r>
-      <w:r>
-        <w:rPr>
-          <w:rFonts w:eastAsia="Courier New" w:cs="Courier New" w:ascii="Courier New" w:hAnsi="Courier New"/>
-          <w:color w:val="333333"/>
-          <w:sz w:val="18"/>
-          <w:szCs w:val="18"/>
-        </w:rPr>
-        <w:t>-p step5_input.psf \</w:t>
-      </w:r>
-    </w:p>
-    <w:p>
-      <w:pPr>
-        <w:pStyle w:val="Normal"/>
-        <w:shd w:val="clear" w:fill="F4F4F4"/>
-        <w:spacing w:before="60" w:after="60"/>
-        <w:ind w:left="720" w:hanging="0"/>
-        <w:jc w:val="both"/>
-        <w:rPr/>
-      </w:pPr>
-      <w:r>
-        <w:rPr>
-          <w:rFonts w:eastAsia="Courier New" w:cs="Courier New" w:ascii="Courier New" w:hAnsi="Courier New"/>
-          <w:color w:val="333333"/>
-          <w:sz w:val="18"/>
-          <w:szCs w:val="18"/>
-        </w:rPr>
-        <w:t xml:space="preserve">  </w:t>
-      </w:r>
-      <w:r>
-        <w:rPr>
-          <w:rFonts w:eastAsia="Courier New" w:cs="Courier New" w:ascii="Courier New" w:hAnsi="Courier New"/>
-          <w:color w:val="333333"/>
-          <w:sz w:val="18"/>
-          <w:szCs w:val="18"/>
-        </w:rPr>
-        <w:t>-c step5_input.crd \</w:t>
-      </w:r>
-    </w:p>
-    <w:p>
-      <w:pPr>
-        <w:pStyle w:val="Normal"/>
-        <w:shd w:val="clear" w:fill="F4F4F4"/>
-        <w:spacing w:before="60" w:after="60"/>
-        <w:ind w:left="720" w:hanging="0"/>
-        <w:jc w:val="both"/>
-        <w:rPr/>
-      </w:pPr>
-      <w:r>
-        <w:rPr>
-          <w:rFonts w:eastAsia="Courier New" w:cs="Courier New" w:ascii="Courier New" w:hAnsi="Courier New"/>
-          <w:color w:val="333333"/>
-          <w:sz w:val="18"/>
-          <w:szCs w:val="18"/>
-        </w:rPr>
-        <w:t xml:space="preserve">  </w:t>
-      </w:r>
-      <w:r>
-        <w:rPr>
-          <w:rFonts w:eastAsia="Courier New" w:cs="Courier New" w:ascii="Courier New" w:hAnsi="Courier New"/>
-          <w:color w:val="333333"/>
-          <w:sz w:val="18"/>
-          <w:szCs w:val="18"/>
-        </w:rPr>
-        <w:t>-irst step6.6_equilibration.rst \</w:t>
-      </w:r>
-    </w:p>
-    <w:p>
-      <w:pPr>
-        <w:pStyle w:val="Normal"/>
-        <w:shd w:val="clear" w:fill="F4F4F4"/>
-        <w:spacing w:before="60" w:after="60"/>
-        <w:ind w:left="720" w:hanging="0"/>
-        <w:jc w:val="both"/>
-        <w:rPr/>
-      </w:pPr>
-      <w:r>
-        <w:rPr>
-          <w:rFonts w:eastAsia="Courier New" w:cs="Courier New" w:ascii="Courier New" w:hAnsi="Courier New"/>
-          <w:color w:val="333333"/>
-          <w:sz w:val="18"/>
-          <w:szCs w:val="18"/>
-        </w:rPr>
-        <w:t xml:space="preserve">  </w:t>
-      </w:r>
-      <w:r>
-        <w:rPr>
-          <w:rFonts w:eastAsia="Courier New" w:cs="Courier New" w:ascii="Courier New" w:hAnsi="Courier New"/>
-          <w:color w:val="333333"/>
-          <w:sz w:val="18"/>
-          <w:szCs w:val="18"/>
-        </w:rPr>
-        <w:t>-orst step7_1.rst \</w:t>
-      </w:r>
-    </w:p>
-    <w:p>
-      <w:pPr>
-        <w:pStyle w:val="Normal"/>
-        <w:shd w:val="clear" w:fill="F4F4F4"/>
-        <w:spacing w:before="60" w:after="60"/>
-        <w:ind w:left="720" w:hanging="0"/>
-        <w:jc w:val="both"/>
-        <w:rPr/>
-      </w:pPr>
-      <w:r>
-        <w:rPr>
-          <w:rFonts w:eastAsia="Courier New" w:cs="Courier New" w:ascii="Courier New" w:hAnsi="Courier New"/>
-          <w:color w:val="333333"/>
-          <w:sz w:val="18"/>
-          <w:szCs w:val="18"/>
-        </w:rPr>
-        <w:t xml:space="preserve">  </w:t>
-      </w:r>
-      <w:r>
-        <w:rPr>
-          <w:rFonts w:eastAsia="Courier New" w:cs="Courier New" w:ascii="Courier New" w:hAnsi="Courier New"/>
-          <w:color w:val="333333"/>
-          <w:sz w:val="18"/>
-          <w:szCs w:val="18"/>
-        </w:rPr>
-        <w:t>-odcd step7_1.dcd &gt; step7_1.out</w:t>
-      </w:r>
-    </w:p>
-    <w:p>
-      <w:pPr>
-        <w:pStyle w:val="Heading2"/>
-        <w:spacing w:before="200" w:after="80"/>
-        <w:jc w:val="both"/>
-        <w:rPr/>
-      </w:pPr>
+        <w:t xml:space="preserve">3.2. Run </w:t>
+      </w:r>
       <w:r>
         <w:rPr>
           <w:rFonts w:eastAsia="Arial" w:cs="Arial" w:ascii="Arial" w:hAnsi="Arial"/>
@@ -1191,7 +957,1172 @@
           <w:sz w:val="24"/>
           <w:szCs w:val="24"/>
         </w:rPr>
-        <w:t>3.3. Continue Production (Segments 2–10)</w:t>
+        <w:t>All</w:t>
+      </w:r>
+      <w:r>
+        <w:rPr>
+          <w:rFonts w:eastAsia="Arial" w:cs="Arial" w:ascii="Arial" w:hAnsi="Arial"/>
+          <w:b/>
+          <w:bCs/>
+          <w:color w:val="2E6DA4"/>
+          <w:sz w:val="24"/>
+          <w:szCs w:val="24"/>
+        </w:rPr>
+        <w:t xml:space="preserve"> Production Segment</w:t>
+      </w:r>
+      <w:r>
+        <w:rPr>
+          <w:rFonts w:eastAsia="Arial" w:cs="Arial" w:ascii="Arial" w:hAnsi="Arial"/>
+          <w:b/>
+          <w:bCs/>
+          <w:color w:val="2E6DA4"/>
+          <w:sz w:val="24"/>
+          <w:szCs w:val="24"/>
+        </w:rPr>
+        <w:t>s</w:t>
+      </w:r>
+    </w:p>
+    <w:p>
+      <w:pPr>
+        <w:pStyle w:val="Normal"/>
+        <w:shd w:val="clear" w:fill="F4F4F4"/>
+        <w:spacing w:before="60" w:after="60"/>
+        <w:ind w:left="720" w:hanging="0"/>
+        <w:jc w:val="both"/>
+        <w:rPr/>
+      </w:pPr>
+      <w:r>
+        <w:rPr>
+          <w:rFonts w:eastAsia="Courier New" w:cs="Courier New" w:ascii="Courier New" w:hAnsi="Courier New"/>
+          <w:color w:val="8100C2"/>
+          <w:sz w:val="18"/>
+          <w:szCs w:val="18"/>
+        </w:rPr>
+        <w:t>for</w:t>
+      </w:r>
+      <w:r>
+        <w:rPr>
+          <w:rFonts w:eastAsia="Courier New" w:cs="Courier New" w:ascii="Courier New" w:hAnsi="Courier New"/>
+          <w:color w:val="333333"/>
+          <w:sz w:val="18"/>
+          <w:szCs w:val="18"/>
+        </w:rPr>
+        <w:t xml:space="preserve"> </w:t>
+      </w:r>
+      <w:r>
+        <w:rPr>
+          <w:rFonts w:eastAsia="Courier New" w:cs="Courier New" w:ascii="Courier New" w:hAnsi="Courier New"/>
+          <w:color w:val="B34A00"/>
+          <w:sz w:val="18"/>
+          <w:szCs w:val="18"/>
+        </w:rPr>
+        <w:t>cnt</w:t>
+      </w:r>
+      <w:r>
+        <w:rPr>
+          <w:rFonts w:eastAsia="Courier New" w:cs="Courier New" w:ascii="Courier New" w:hAnsi="Courier New"/>
+          <w:color w:val="333333"/>
+          <w:sz w:val="18"/>
+          <w:szCs w:val="18"/>
+        </w:rPr>
+        <w:t xml:space="preserve"> </w:t>
+      </w:r>
+      <w:r>
+        <w:rPr>
+          <w:rFonts w:eastAsia="Courier New" w:cs="Courier New" w:ascii="Courier New" w:hAnsi="Courier New"/>
+          <w:color w:val="8100C2"/>
+          <w:sz w:val="18"/>
+          <w:szCs w:val="18"/>
+        </w:rPr>
+        <w:t>in</w:t>
+      </w:r>
+      <w:r>
+        <w:rPr>
+          <w:rFonts w:eastAsia="Courier New" w:cs="Courier New" w:ascii="Courier New" w:hAnsi="Courier New"/>
+          <w:color w:val="333333"/>
+          <w:sz w:val="18"/>
+          <w:szCs w:val="18"/>
+        </w:rPr>
+        <w:t xml:space="preserve"> </w:t>
+      </w:r>
+      <w:r>
+        <w:rPr>
+          <w:rFonts w:eastAsia="Courier New" w:cs="Courier New" w:ascii="Courier New" w:hAnsi="Courier New"/>
+          <w:color w:val="008080"/>
+          <w:sz w:val="18"/>
+          <w:szCs w:val="18"/>
+        </w:rPr>
+        <w:t>1</w:t>
+      </w:r>
+      <w:r>
+        <w:rPr>
+          <w:rFonts w:eastAsia="Courier New" w:cs="Courier New" w:ascii="Courier New" w:hAnsi="Courier New"/>
+          <w:color w:val="333333"/>
+          <w:sz w:val="18"/>
+          <w:szCs w:val="18"/>
+        </w:rPr>
+        <w:t xml:space="preserve"> </w:t>
+      </w:r>
+      <w:r>
+        <w:rPr>
+          <w:rFonts w:eastAsia="Courier New" w:cs="Courier New" w:ascii="Courier New" w:hAnsi="Courier New"/>
+          <w:color w:val="008080"/>
+          <w:sz w:val="18"/>
+          <w:szCs w:val="18"/>
+        </w:rPr>
+        <w:t>2</w:t>
+      </w:r>
+      <w:r>
+        <w:rPr>
+          <w:rFonts w:eastAsia="Courier New" w:cs="Courier New" w:ascii="Courier New" w:hAnsi="Courier New"/>
+          <w:color w:val="333333"/>
+          <w:sz w:val="18"/>
+          <w:szCs w:val="18"/>
+        </w:rPr>
+        <w:t xml:space="preserve"> </w:t>
+      </w:r>
+      <w:r>
+        <w:rPr>
+          <w:rFonts w:eastAsia="Courier New" w:cs="Courier New" w:ascii="Courier New" w:hAnsi="Courier New"/>
+          <w:color w:val="008080"/>
+          <w:sz w:val="18"/>
+          <w:szCs w:val="18"/>
+        </w:rPr>
+        <w:t>3</w:t>
+      </w:r>
+      <w:r>
+        <w:rPr>
+          <w:rFonts w:eastAsia="Courier New" w:cs="Courier New" w:ascii="Courier New" w:hAnsi="Courier New"/>
+          <w:color w:val="333333"/>
+          <w:sz w:val="18"/>
+          <w:szCs w:val="18"/>
+        </w:rPr>
+        <w:t xml:space="preserve"> </w:t>
+      </w:r>
+      <w:r>
+        <w:rPr>
+          <w:rFonts w:eastAsia="Courier New" w:cs="Courier New" w:ascii="Courier New" w:hAnsi="Courier New"/>
+          <w:color w:val="008080"/>
+          <w:sz w:val="18"/>
+          <w:szCs w:val="18"/>
+        </w:rPr>
+        <w:t>4</w:t>
+      </w:r>
+      <w:r>
+        <w:rPr>
+          <w:rFonts w:eastAsia="Courier New" w:cs="Courier New" w:ascii="Courier New" w:hAnsi="Courier New"/>
+          <w:color w:val="333333"/>
+          <w:sz w:val="18"/>
+          <w:szCs w:val="18"/>
+        </w:rPr>
+        <w:t xml:space="preserve"> </w:t>
+      </w:r>
+      <w:r>
+        <w:rPr>
+          <w:rFonts w:eastAsia="Courier New" w:cs="Courier New" w:ascii="Courier New" w:hAnsi="Courier New"/>
+          <w:color w:val="008080"/>
+          <w:sz w:val="18"/>
+          <w:szCs w:val="18"/>
+        </w:rPr>
+        <w:t>5</w:t>
+      </w:r>
+      <w:r>
+        <w:rPr>
+          <w:rFonts w:eastAsia="Courier New" w:cs="Courier New" w:ascii="Courier New" w:hAnsi="Courier New"/>
+          <w:color w:val="333333"/>
+          <w:sz w:val="18"/>
+          <w:szCs w:val="18"/>
+        </w:rPr>
+        <w:t xml:space="preserve"> </w:t>
+      </w:r>
+      <w:r>
+        <w:rPr>
+          <w:rFonts w:eastAsia="Courier New" w:cs="Courier New" w:ascii="Courier New" w:hAnsi="Courier New"/>
+          <w:color w:val="008080"/>
+          <w:sz w:val="18"/>
+          <w:szCs w:val="18"/>
+        </w:rPr>
+        <w:t>6</w:t>
+      </w:r>
+      <w:r>
+        <w:rPr>
+          <w:rFonts w:eastAsia="Courier New" w:cs="Courier New" w:ascii="Courier New" w:hAnsi="Courier New"/>
+          <w:color w:val="333333"/>
+          <w:sz w:val="18"/>
+          <w:szCs w:val="18"/>
+        </w:rPr>
+        <w:t xml:space="preserve"> </w:t>
+      </w:r>
+      <w:r>
+        <w:rPr>
+          <w:rFonts w:eastAsia="Courier New" w:cs="Courier New" w:ascii="Courier New" w:hAnsi="Courier New"/>
+          <w:color w:val="008080"/>
+          <w:sz w:val="18"/>
+          <w:szCs w:val="18"/>
+        </w:rPr>
+        <w:t>7</w:t>
+      </w:r>
+      <w:r>
+        <w:rPr>
+          <w:rFonts w:eastAsia="Courier New" w:cs="Courier New" w:ascii="Courier New" w:hAnsi="Courier New"/>
+          <w:color w:val="333333"/>
+          <w:sz w:val="18"/>
+          <w:szCs w:val="18"/>
+        </w:rPr>
+        <w:t xml:space="preserve"> </w:t>
+      </w:r>
+      <w:r>
+        <w:rPr>
+          <w:rFonts w:eastAsia="Courier New" w:cs="Courier New" w:ascii="Courier New" w:hAnsi="Courier New"/>
+          <w:color w:val="008080"/>
+          <w:sz w:val="18"/>
+          <w:szCs w:val="18"/>
+        </w:rPr>
+        <w:t>8</w:t>
+      </w:r>
+      <w:r>
+        <w:rPr>
+          <w:rFonts w:eastAsia="Courier New" w:cs="Courier New" w:ascii="Courier New" w:hAnsi="Courier New"/>
+          <w:color w:val="333333"/>
+          <w:sz w:val="18"/>
+          <w:szCs w:val="18"/>
+        </w:rPr>
+        <w:t xml:space="preserve"> </w:t>
+      </w:r>
+      <w:r>
+        <w:rPr>
+          <w:rFonts w:eastAsia="Courier New" w:cs="Courier New" w:ascii="Courier New" w:hAnsi="Courier New"/>
+          <w:color w:val="008080"/>
+          <w:sz w:val="18"/>
+          <w:szCs w:val="18"/>
+        </w:rPr>
+        <w:t>9</w:t>
+      </w:r>
+      <w:r>
+        <w:rPr>
+          <w:rFonts w:eastAsia="Courier New" w:cs="Courier New" w:ascii="Courier New" w:hAnsi="Courier New"/>
+          <w:color w:val="333333"/>
+          <w:sz w:val="18"/>
+          <w:szCs w:val="18"/>
+        </w:rPr>
+        <w:t xml:space="preserve"> </w:t>
+      </w:r>
+      <w:r>
+        <w:rPr>
+          <w:rFonts w:eastAsia="Courier New" w:cs="Courier New" w:ascii="Courier New" w:hAnsi="Courier New"/>
+          <w:color w:val="008080"/>
+          <w:sz w:val="18"/>
+          <w:szCs w:val="18"/>
+        </w:rPr>
+        <w:t>10</w:t>
+      </w:r>
+      <w:r>
+        <w:rPr>
+          <w:rFonts w:eastAsia="Courier New" w:cs="Courier New" w:ascii="Courier New" w:hAnsi="Courier New"/>
+          <w:color w:val="2B303B"/>
+          <w:sz w:val="18"/>
+          <w:szCs w:val="18"/>
+        </w:rPr>
+        <w:t>;</w:t>
+      </w:r>
+      <w:r>
+        <w:rPr>
+          <w:rFonts w:eastAsia="Courier New" w:cs="Courier New" w:ascii="Courier New" w:hAnsi="Courier New"/>
+          <w:color w:val="333333"/>
+          <w:sz w:val="18"/>
+          <w:szCs w:val="18"/>
+        </w:rPr>
+        <w:t xml:space="preserve"> </w:t>
+      </w:r>
+      <w:r>
+        <w:rPr>
+          <w:rFonts w:eastAsia="Courier New" w:cs="Courier New" w:ascii="Courier New" w:hAnsi="Courier New"/>
+          <w:color w:val="8100C2"/>
+          <w:sz w:val="18"/>
+          <w:szCs w:val="18"/>
+        </w:rPr>
+        <w:t>do</w:t>
+      </w:r>
+    </w:p>
+    <w:p>
+      <w:pPr>
+        <w:pStyle w:val="Normal"/>
+        <w:shd w:val="clear" w:fill="F4F4F4"/>
+        <w:spacing w:before="60" w:after="60"/>
+        <w:ind w:left="720" w:hanging="0"/>
+        <w:jc w:val="both"/>
+        <w:rPr/>
+      </w:pPr>
+      <w:r>
+        <w:rPr>
+          <w:rFonts w:eastAsia="Courier New" w:cs="Courier New" w:ascii="Courier New" w:hAnsi="Courier New"/>
+          <w:color w:val="333333"/>
+          <w:sz w:val="18"/>
+          <w:szCs w:val="18"/>
+        </w:rPr>
+        <w:t xml:space="preserve">    </w:t>
+      </w:r>
+      <w:r>
+        <w:rPr>
+          <w:rFonts w:eastAsia="Courier New" w:cs="Courier New" w:ascii="Courier New" w:hAnsi="Courier New"/>
+          <w:color w:val="B34A00"/>
+          <w:sz w:val="18"/>
+          <w:szCs w:val="18"/>
+        </w:rPr>
+        <w:t>pcnt</w:t>
+      </w:r>
+      <w:r>
+        <w:rPr>
+          <w:rFonts w:eastAsia="Courier New" w:cs="Courier New" w:ascii="Courier New" w:hAnsi="Courier New"/>
+          <w:color w:val="14181F"/>
+          <w:sz w:val="18"/>
+          <w:szCs w:val="18"/>
+        </w:rPr>
+        <w:t>=</w:t>
+      </w:r>
+      <w:r>
+        <w:rPr>
+          <w:rFonts w:eastAsia="Courier New" w:cs="Courier New" w:ascii="Courier New" w:hAnsi="Courier New"/>
+          <w:color w:val="B34A00"/>
+          <w:sz w:val="18"/>
+          <w:szCs w:val="18"/>
+        </w:rPr>
+        <w:t>$((cnt</w:t>
+      </w:r>
+      <w:r>
+        <w:rPr>
+          <w:rFonts w:eastAsia="Courier New" w:cs="Courier New" w:ascii="Courier New" w:hAnsi="Courier New"/>
+          <w:color w:val="14181F"/>
+          <w:sz w:val="18"/>
+          <w:szCs w:val="18"/>
+        </w:rPr>
+        <w:t>-</w:t>
+      </w:r>
+      <w:r>
+        <w:rPr>
+          <w:rFonts w:eastAsia="Courier New" w:cs="Courier New" w:ascii="Courier New" w:hAnsi="Courier New"/>
+          <w:color w:val="008080"/>
+          <w:sz w:val="18"/>
+          <w:szCs w:val="18"/>
+        </w:rPr>
+        <w:t>1</w:t>
+      </w:r>
+      <w:r>
+        <w:rPr>
+          <w:rFonts w:eastAsia="Courier New" w:cs="Courier New" w:ascii="Courier New" w:hAnsi="Courier New"/>
+          <w:color w:val="B34A00"/>
+          <w:sz w:val="18"/>
+          <w:szCs w:val="18"/>
+        </w:rPr>
+        <w:t>))</w:t>
+      </w:r>
+    </w:p>
+    <w:p>
+      <w:pPr>
+        <w:pStyle w:val="Normal"/>
+        <w:shd w:val="clear" w:fill="F4F4F4"/>
+        <w:spacing w:before="60" w:after="60"/>
+        <w:ind w:left="720" w:hanging="0"/>
+        <w:jc w:val="both"/>
+        <w:rPr/>
+      </w:pPr>
+      <w:r>
+        <w:rPr>
+          <w:rFonts w:eastAsia="Courier New" w:cs="Courier New" w:ascii="Courier New" w:hAnsi="Courier New"/>
+          <w:color w:val="333333"/>
+          <w:sz w:val="18"/>
+          <w:szCs w:val="18"/>
+        </w:rPr>
+        <w:t xml:space="preserve">    </w:t>
+      </w:r>
+      <w:r>
+        <w:rPr>
+          <w:rFonts w:eastAsia="Courier New" w:cs="Courier New" w:ascii="Courier New" w:hAnsi="Courier New"/>
+          <w:color w:val="8100C2"/>
+          <w:sz w:val="18"/>
+          <w:szCs w:val="18"/>
+        </w:rPr>
+        <w:t>if</w:t>
+      </w:r>
+      <w:r>
+        <w:rPr>
+          <w:rFonts w:eastAsia="Courier New" w:cs="Courier New" w:ascii="Courier New" w:hAnsi="Courier New"/>
+          <w:color w:val="333333"/>
+          <w:sz w:val="18"/>
+          <w:szCs w:val="18"/>
+        </w:rPr>
+        <w:t xml:space="preserve"> </w:t>
+      </w:r>
+      <w:r>
+        <w:rPr>
+          <w:rFonts w:eastAsia="Courier New" w:cs="Courier New" w:ascii="Courier New" w:hAnsi="Courier New"/>
+          <w:color w:val="2B303B"/>
+          <w:sz w:val="18"/>
+          <w:szCs w:val="18"/>
+        </w:rPr>
+        <w:t>[</w:t>
+      </w:r>
+      <w:r>
+        <w:rPr>
+          <w:rFonts w:eastAsia="Courier New" w:cs="Courier New" w:ascii="Courier New" w:hAnsi="Courier New"/>
+          <w:color w:val="333333"/>
+          <w:sz w:val="18"/>
+          <w:szCs w:val="18"/>
+        </w:rPr>
+        <w:t xml:space="preserve"> </w:t>
+      </w:r>
+      <w:r>
+        <w:rPr>
+          <w:rFonts w:eastAsia="Courier New" w:cs="Courier New" w:ascii="Courier New" w:hAnsi="Courier New"/>
+          <w:color w:val="B34A00"/>
+          <w:sz w:val="18"/>
+          <w:szCs w:val="18"/>
+        </w:rPr>
+        <w:t>$cnt</w:t>
+      </w:r>
+      <w:r>
+        <w:rPr>
+          <w:rFonts w:eastAsia="Courier New" w:cs="Courier New" w:ascii="Courier New" w:hAnsi="Courier New"/>
+          <w:color w:val="333333"/>
+          <w:sz w:val="18"/>
+          <w:szCs w:val="18"/>
+        </w:rPr>
+        <w:t xml:space="preserve"> -eq </w:t>
+      </w:r>
+      <w:r>
+        <w:rPr>
+          <w:rFonts w:eastAsia="Courier New" w:cs="Courier New" w:ascii="Courier New" w:hAnsi="Courier New"/>
+          <w:color w:val="008080"/>
+          <w:sz w:val="18"/>
+          <w:szCs w:val="18"/>
+        </w:rPr>
+        <w:t>1</w:t>
+      </w:r>
+      <w:r>
+        <w:rPr>
+          <w:rFonts w:eastAsia="Courier New" w:cs="Courier New" w:ascii="Courier New" w:hAnsi="Courier New"/>
+          <w:color w:val="333333"/>
+          <w:sz w:val="18"/>
+          <w:szCs w:val="18"/>
+        </w:rPr>
+        <w:t xml:space="preserve"> </w:t>
+      </w:r>
+      <w:r>
+        <w:rPr>
+          <w:rFonts w:eastAsia="Courier New" w:cs="Courier New" w:ascii="Courier New" w:hAnsi="Courier New"/>
+          <w:color w:val="2B303B"/>
+          <w:sz w:val="18"/>
+          <w:szCs w:val="18"/>
+        </w:rPr>
+        <w:t>];</w:t>
+      </w:r>
+      <w:r>
+        <w:rPr>
+          <w:rFonts w:eastAsia="Courier New" w:cs="Courier New" w:ascii="Courier New" w:hAnsi="Courier New"/>
+          <w:color w:val="333333"/>
+          <w:sz w:val="18"/>
+          <w:szCs w:val="18"/>
+        </w:rPr>
+        <w:t xml:space="preserve"> </w:t>
+      </w:r>
+      <w:r>
+        <w:rPr>
+          <w:rFonts w:eastAsia="Courier New" w:cs="Courier New" w:ascii="Courier New" w:hAnsi="Courier New"/>
+          <w:color w:val="8100C2"/>
+          <w:sz w:val="18"/>
+          <w:szCs w:val="18"/>
+        </w:rPr>
+        <w:t>then</w:t>
+      </w:r>
+    </w:p>
+    <w:p>
+      <w:pPr>
+        <w:pStyle w:val="Normal"/>
+        <w:shd w:val="clear" w:fill="F4F4F4"/>
+        <w:spacing w:before="60" w:after="60"/>
+        <w:ind w:left="720" w:hanging="0"/>
+        <w:jc w:val="both"/>
+        <w:rPr/>
+      </w:pPr>
+      <w:r>
+        <w:rPr>
+          <w:rFonts w:eastAsia="Courier New" w:cs="Courier New" w:ascii="Courier New" w:hAnsi="Courier New"/>
+          <w:color w:val="333333"/>
+          <w:sz w:val="18"/>
+          <w:szCs w:val="18"/>
+        </w:rPr>
+        <w:t xml:space="preserve">        </w:t>
+      </w:r>
+      <w:r>
+        <w:rPr>
+          <w:rFonts w:eastAsia="Courier New" w:cs="Courier New" w:ascii="Courier New" w:hAnsi="Courier New"/>
+          <w:color w:val="B34A00"/>
+          <w:sz w:val="18"/>
+          <w:szCs w:val="18"/>
+        </w:rPr>
+        <w:t>irst</w:t>
+      </w:r>
+      <w:r>
+        <w:rPr>
+          <w:rFonts w:eastAsia="Courier New" w:cs="Courier New" w:ascii="Courier New" w:hAnsi="Courier New"/>
+          <w:color w:val="14181F"/>
+          <w:sz w:val="18"/>
+          <w:szCs w:val="18"/>
+        </w:rPr>
+        <w:t>=</w:t>
+      </w:r>
+      <w:r>
+        <w:rPr>
+          <w:rFonts w:eastAsia="Courier New" w:cs="Courier New" w:ascii="Courier New" w:hAnsi="Courier New"/>
+          <w:color w:val="008000"/>
+          <w:sz w:val="18"/>
+          <w:szCs w:val="18"/>
+        </w:rPr>
+        <w:t>"step6.6_equilibration.rst"</w:t>
+      </w:r>
+    </w:p>
+    <w:p>
+      <w:pPr>
+        <w:pStyle w:val="Normal"/>
+        <w:shd w:val="clear" w:fill="F4F4F4"/>
+        <w:spacing w:before="60" w:after="60"/>
+        <w:ind w:left="720" w:hanging="0"/>
+        <w:jc w:val="both"/>
+        <w:rPr/>
+      </w:pPr>
+      <w:r>
+        <w:rPr>
+          <w:rFonts w:eastAsia="Courier New" w:cs="Courier New" w:ascii="Courier New" w:hAnsi="Courier New"/>
+          <w:color w:val="333333"/>
+          <w:sz w:val="18"/>
+          <w:szCs w:val="18"/>
+        </w:rPr>
+        <w:t xml:space="preserve">    </w:t>
+      </w:r>
+      <w:r>
+        <w:rPr>
+          <w:rFonts w:eastAsia="Courier New" w:cs="Courier New" w:ascii="Courier New" w:hAnsi="Courier New"/>
+          <w:color w:val="8100C2"/>
+          <w:sz w:val="18"/>
+          <w:szCs w:val="18"/>
+        </w:rPr>
+        <w:t>else</w:t>
+      </w:r>
+    </w:p>
+    <w:p>
+      <w:pPr>
+        <w:pStyle w:val="Normal"/>
+        <w:shd w:val="clear" w:fill="F4F4F4"/>
+        <w:spacing w:before="60" w:after="60"/>
+        <w:ind w:left="720" w:hanging="0"/>
+        <w:jc w:val="both"/>
+        <w:rPr/>
+      </w:pPr>
+      <w:r>
+        <w:rPr>
+          <w:rFonts w:eastAsia="Courier New" w:cs="Courier New" w:ascii="Courier New" w:hAnsi="Courier New"/>
+          <w:color w:val="333333"/>
+          <w:sz w:val="18"/>
+          <w:szCs w:val="18"/>
+        </w:rPr>
+        <w:t xml:space="preserve">        </w:t>
+      </w:r>
+      <w:r>
+        <w:rPr>
+          <w:rFonts w:eastAsia="Courier New" w:cs="Courier New" w:ascii="Courier New" w:hAnsi="Courier New"/>
+          <w:color w:val="B34A00"/>
+          <w:sz w:val="18"/>
+          <w:szCs w:val="18"/>
+        </w:rPr>
+        <w:t>irst</w:t>
+      </w:r>
+      <w:r>
+        <w:rPr>
+          <w:rFonts w:eastAsia="Courier New" w:cs="Courier New" w:ascii="Courier New" w:hAnsi="Courier New"/>
+          <w:color w:val="14181F"/>
+          <w:sz w:val="18"/>
+          <w:szCs w:val="18"/>
+        </w:rPr>
+        <w:t>=</w:t>
+      </w:r>
+      <w:r>
+        <w:rPr>
+          <w:rFonts w:eastAsia="Courier New" w:cs="Courier New" w:ascii="Courier New" w:hAnsi="Courier New"/>
+          <w:color w:val="008000"/>
+          <w:sz w:val="18"/>
+          <w:szCs w:val="18"/>
+        </w:rPr>
+        <w:t>"step7_</w:t>
+      </w:r>
+      <w:r>
+        <w:rPr>
+          <w:rFonts w:eastAsia="Courier New" w:cs="Courier New" w:ascii="Courier New" w:hAnsi="Courier New"/>
+          <w:color w:val="B34A00"/>
+          <w:sz w:val="18"/>
+          <w:szCs w:val="18"/>
+        </w:rPr>
+        <w:t>${pcnt}</w:t>
+      </w:r>
+      <w:r>
+        <w:rPr>
+          <w:rFonts w:eastAsia="Courier New" w:cs="Courier New" w:ascii="Courier New" w:hAnsi="Courier New"/>
+          <w:color w:val="008000"/>
+          <w:sz w:val="18"/>
+          <w:szCs w:val="18"/>
+        </w:rPr>
+        <w:t>.rst"</w:t>
+      </w:r>
+    </w:p>
+    <w:p>
+      <w:pPr>
+        <w:pStyle w:val="Normal"/>
+        <w:shd w:val="clear" w:fill="F4F4F4"/>
+        <w:spacing w:before="60" w:after="60"/>
+        <w:ind w:left="720" w:hanging="0"/>
+        <w:jc w:val="both"/>
+        <w:rPr/>
+      </w:pPr>
+      <w:r>
+        <w:rPr>
+          <w:rFonts w:eastAsia="Courier New" w:cs="Courier New" w:ascii="Courier New" w:hAnsi="Courier New"/>
+          <w:color w:val="333333"/>
+          <w:sz w:val="18"/>
+          <w:szCs w:val="18"/>
+        </w:rPr>
+        <w:t xml:space="preserve">    </w:t>
+      </w:r>
+      <w:r>
+        <w:rPr>
+          <w:rFonts w:eastAsia="Courier New" w:cs="Courier New" w:ascii="Courier New" w:hAnsi="Courier New"/>
+          <w:color w:val="8100C2"/>
+          <w:sz w:val="18"/>
+          <w:szCs w:val="18"/>
+        </w:rPr>
+        <w:t>fi</w:t>
+      </w:r>
+    </w:p>
+    <w:p>
+      <w:pPr>
+        <w:pStyle w:val="Normal"/>
+        <w:shd w:val="clear" w:fill="F4F4F4"/>
+        <w:spacing w:before="60" w:after="60"/>
+        <w:ind w:left="720" w:hanging="0"/>
+        <w:jc w:val="both"/>
+        <w:rPr/>
+      </w:pPr>
+      <w:r>
+        <w:rPr>
+          <w:rFonts w:eastAsia="Courier New" w:cs="Courier New" w:ascii="Courier New" w:hAnsi="Courier New"/>
+          <w:color w:val="333333"/>
+          <w:sz w:val="18"/>
+          <w:szCs w:val="18"/>
+        </w:rPr>
+        <w:t xml:space="preserve">    </w:t>
+      </w:r>
+      <w:r>
+        <w:rPr>
+          <w:rFonts w:eastAsia="Courier New" w:cs="Courier New" w:ascii="Courier New" w:hAnsi="Courier New"/>
+          <w:color w:val="B34A00"/>
+          <w:sz w:val="18"/>
+          <w:szCs w:val="18"/>
+        </w:rPr>
+        <w:t>echo</w:t>
+      </w:r>
+      <w:r>
+        <w:rPr>
+          <w:rFonts w:eastAsia="Courier New" w:cs="Courier New" w:ascii="Courier New" w:hAnsi="Courier New"/>
+          <w:color w:val="333333"/>
+          <w:sz w:val="18"/>
+          <w:szCs w:val="18"/>
+        </w:rPr>
+        <w:t xml:space="preserve"> </w:t>
+      </w:r>
+      <w:r>
+        <w:rPr>
+          <w:rFonts w:eastAsia="Courier New" w:cs="Courier New" w:ascii="Courier New" w:hAnsi="Courier New"/>
+          <w:color w:val="008000"/>
+          <w:sz w:val="18"/>
+          <w:szCs w:val="18"/>
+        </w:rPr>
+        <w:t xml:space="preserve">"Starting segment </w:t>
+      </w:r>
+      <w:r>
+        <w:rPr>
+          <w:rFonts w:eastAsia="Courier New" w:cs="Courier New" w:ascii="Courier New" w:hAnsi="Courier New"/>
+          <w:color w:val="B34A00"/>
+          <w:sz w:val="18"/>
+          <w:szCs w:val="18"/>
+        </w:rPr>
+        <w:t>${cnt}…</w:t>
+      </w:r>
+      <w:r>
+        <w:rPr>
+          <w:rFonts w:eastAsia="Courier New" w:cs="Courier New" w:ascii="Courier New" w:hAnsi="Courier New"/>
+          <w:color w:val="008000"/>
+          <w:sz w:val="18"/>
+          <w:szCs w:val="18"/>
+        </w:rPr>
+        <w:t>"</w:t>
+      </w:r>
+    </w:p>
+    <w:p>
+      <w:pPr>
+        <w:pStyle w:val="Normal"/>
+        <w:shd w:val="clear" w:fill="F4F4F4"/>
+        <w:spacing w:before="60" w:after="60"/>
+        <w:ind w:left="720" w:hanging="0"/>
+        <w:jc w:val="both"/>
+        <w:rPr/>
+      </w:pPr>
+      <w:r>
+        <w:rPr>
+          <w:rFonts w:eastAsia="Courier New" w:cs="Courier New" w:ascii="Courier New" w:hAnsi="Courier New"/>
+          <w:color w:val="333333"/>
+          <w:sz w:val="18"/>
+          <w:szCs w:val="18"/>
+        </w:rPr>
+        <w:t xml:space="preserve">    </w:t>
+      </w:r>
+      <w:r>
+        <w:rPr>
+          <w:rFonts w:eastAsia="Courier New" w:cs="Courier New" w:ascii="Courier New" w:hAnsi="Courier New"/>
+          <w:color w:val="333333"/>
+          <w:sz w:val="18"/>
+          <w:szCs w:val="18"/>
+        </w:rPr>
+        <w:t xml:space="preserve">python -u openmm_run.py </w:t>
+      </w:r>
+      <w:r>
+        <w:rPr>
+          <w:rFonts w:eastAsia="Courier New" w:cs="Courier New" w:ascii="Courier New" w:hAnsi="Courier New"/>
+          <w:color w:val="2B303B"/>
+          <w:sz w:val="18"/>
+          <w:szCs w:val="18"/>
+        </w:rPr>
+        <w:t>\</w:t>
+      </w:r>
+    </w:p>
+    <w:p>
+      <w:pPr>
+        <w:pStyle w:val="Normal"/>
+        <w:shd w:val="clear" w:fill="F4F4F4"/>
+        <w:spacing w:before="60" w:after="60"/>
+        <w:ind w:left="720" w:hanging="0"/>
+        <w:jc w:val="both"/>
+        <w:rPr/>
+      </w:pPr>
+      <w:r>
+        <w:rPr>
+          <w:rFonts w:eastAsia="Courier New" w:cs="Courier New" w:ascii="Courier New" w:hAnsi="Courier New"/>
+          <w:color w:val="2B303B"/>
+          <w:sz w:val="18"/>
+          <w:szCs w:val="18"/>
+        </w:rPr>
+        <w:tab/>
+      </w:r>
+      <w:r>
+        <w:rPr>
+          <w:rFonts w:eastAsia="Courier New" w:cs="Courier New" w:ascii="Courier New" w:hAnsi="Courier New"/>
+          <w:color w:val="333333"/>
+          <w:sz w:val="18"/>
+          <w:szCs w:val="18"/>
+        </w:rPr>
+        <w:t xml:space="preserve"> -i step7_production.inp </w:t>
+      </w:r>
+      <w:r>
+        <w:rPr>
+          <w:rFonts w:eastAsia="Courier New" w:cs="Courier New" w:ascii="Courier New" w:hAnsi="Courier New"/>
+          <w:color w:val="2B303B"/>
+          <w:sz w:val="18"/>
+          <w:szCs w:val="18"/>
+        </w:rPr>
+        <w:t>\</w:t>
+      </w:r>
+    </w:p>
+    <w:p>
+      <w:pPr>
+        <w:pStyle w:val="Normal"/>
+        <w:shd w:val="clear" w:fill="F4F4F4"/>
+        <w:spacing w:before="60" w:after="60"/>
+        <w:ind w:left="720" w:hanging="0"/>
+        <w:jc w:val="both"/>
+        <w:rPr/>
+      </w:pPr>
+      <w:r>
+        <w:rPr>
+          <w:rFonts w:eastAsia="Courier New" w:cs="Courier New" w:ascii="Courier New" w:hAnsi="Courier New"/>
+          <w:color w:val="2B303B"/>
+          <w:sz w:val="18"/>
+          <w:szCs w:val="18"/>
+        </w:rPr>
+        <w:tab/>
+      </w:r>
+      <w:r>
+        <w:rPr>
+          <w:rFonts w:eastAsia="Courier New" w:cs="Courier New" w:ascii="Courier New" w:hAnsi="Courier New"/>
+          <w:color w:val="333333"/>
+          <w:sz w:val="18"/>
+          <w:szCs w:val="18"/>
+        </w:rPr>
+        <w:t xml:space="preserve"> -t toppar.str </w:t>
+      </w:r>
+      <w:r>
+        <w:rPr>
+          <w:rFonts w:eastAsia="Courier New" w:cs="Courier New" w:ascii="Courier New" w:hAnsi="Courier New"/>
+          <w:color w:val="2B303B"/>
+          <w:sz w:val="18"/>
+          <w:szCs w:val="18"/>
+        </w:rPr>
+        <w:t>\</w:t>
+      </w:r>
+    </w:p>
+    <w:p>
+      <w:pPr>
+        <w:pStyle w:val="Normal"/>
+        <w:shd w:val="clear" w:fill="F4F4F4"/>
+        <w:spacing w:before="60" w:after="60"/>
+        <w:ind w:left="720" w:hanging="0"/>
+        <w:jc w:val="both"/>
+        <w:rPr/>
+      </w:pPr>
+      <w:r>
+        <w:rPr>
+          <w:rFonts w:eastAsia="Courier New" w:cs="Courier New" w:ascii="Courier New" w:hAnsi="Courier New"/>
+          <w:color w:val="2B303B"/>
+          <w:sz w:val="18"/>
+          <w:szCs w:val="18"/>
+        </w:rPr>
+        <w:tab/>
+      </w:r>
+      <w:r>
+        <w:rPr>
+          <w:rFonts w:eastAsia="Courier New" w:cs="Courier New" w:ascii="Courier New" w:hAnsi="Courier New"/>
+          <w:color w:val="333333"/>
+          <w:sz w:val="18"/>
+          <w:szCs w:val="18"/>
+        </w:rPr>
+        <w:t xml:space="preserve"> -p step5_input.psf </w:t>
+      </w:r>
+      <w:r>
+        <w:rPr>
+          <w:rFonts w:eastAsia="Courier New" w:cs="Courier New" w:ascii="Courier New" w:hAnsi="Courier New"/>
+          <w:color w:val="2B303B"/>
+          <w:sz w:val="18"/>
+          <w:szCs w:val="18"/>
+        </w:rPr>
+        <w:t>\</w:t>
+      </w:r>
+    </w:p>
+    <w:p>
+      <w:pPr>
+        <w:pStyle w:val="Normal"/>
+        <w:shd w:val="clear" w:fill="F4F4F4"/>
+        <w:spacing w:before="60" w:after="60"/>
+        <w:ind w:left="720" w:hanging="0"/>
+        <w:jc w:val="both"/>
+        <w:rPr/>
+      </w:pPr>
+      <w:r>
+        <w:rPr>
+          <w:rFonts w:eastAsia="Courier New" w:cs="Courier New" w:ascii="Courier New" w:hAnsi="Courier New"/>
+          <w:color w:val="2B303B"/>
+          <w:sz w:val="18"/>
+          <w:szCs w:val="18"/>
+        </w:rPr>
+        <w:tab/>
+      </w:r>
+      <w:r>
+        <w:rPr>
+          <w:rFonts w:eastAsia="Courier New" w:cs="Courier New" w:ascii="Courier New" w:hAnsi="Courier New"/>
+          <w:color w:val="333333"/>
+          <w:sz w:val="18"/>
+          <w:szCs w:val="18"/>
+        </w:rPr>
+        <w:t xml:space="preserve"> -c step5_input.crd </w:t>
+      </w:r>
+      <w:r>
+        <w:rPr>
+          <w:rFonts w:eastAsia="Courier New" w:cs="Courier New" w:ascii="Courier New" w:hAnsi="Courier New"/>
+          <w:color w:val="2B303B"/>
+          <w:sz w:val="18"/>
+          <w:szCs w:val="18"/>
+        </w:rPr>
+        <w:t>\</w:t>
+      </w:r>
+    </w:p>
+    <w:p>
+      <w:pPr>
+        <w:pStyle w:val="Normal"/>
+        <w:shd w:val="clear" w:fill="F4F4F4"/>
+        <w:spacing w:before="60" w:after="60"/>
+        <w:ind w:left="720" w:hanging="0"/>
+        <w:jc w:val="both"/>
+        <w:rPr/>
+      </w:pPr>
+      <w:r>
+        <w:rPr>
+          <w:rFonts w:eastAsia="Courier New" w:cs="Courier New" w:ascii="Courier New" w:hAnsi="Courier New"/>
+          <w:color w:val="2B303B"/>
+          <w:sz w:val="18"/>
+          <w:szCs w:val="18"/>
+        </w:rPr>
+        <w:tab/>
+      </w:r>
+      <w:r>
+        <w:rPr>
+          <w:rFonts w:eastAsia="Courier New" w:cs="Courier New" w:ascii="Courier New" w:hAnsi="Courier New"/>
+          <w:color w:val="333333"/>
+          <w:sz w:val="18"/>
+          <w:szCs w:val="18"/>
+        </w:rPr>
+        <w:t xml:space="preserve"> -irst </w:t>
+      </w:r>
+      <w:r>
+        <w:rPr>
+          <w:rFonts w:eastAsia="Courier New" w:cs="Courier New" w:ascii="Courier New" w:hAnsi="Courier New"/>
+          <w:color w:val="B34A00"/>
+          <w:sz w:val="18"/>
+          <w:szCs w:val="18"/>
+        </w:rPr>
+        <w:t>${irst}</w:t>
+      </w:r>
+      <w:r>
+        <w:rPr>
+          <w:rFonts w:eastAsia="Courier New" w:cs="Courier New" w:ascii="Courier New" w:hAnsi="Courier New"/>
+          <w:color w:val="333333"/>
+          <w:sz w:val="18"/>
+          <w:szCs w:val="18"/>
+        </w:rPr>
+        <w:t xml:space="preserve"> </w:t>
+      </w:r>
+      <w:r>
+        <w:rPr>
+          <w:rFonts w:eastAsia="Courier New" w:cs="Courier New" w:ascii="Courier New" w:hAnsi="Courier New"/>
+          <w:color w:val="2B303B"/>
+          <w:sz w:val="18"/>
+          <w:szCs w:val="18"/>
+        </w:rPr>
+        <w:t>\</w:t>
+      </w:r>
+    </w:p>
+    <w:p>
+      <w:pPr>
+        <w:pStyle w:val="Normal"/>
+        <w:shd w:val="clear" w:fill="F4F4F4"/>
+        <w:spacing w:before="60" w:after="60"/>
+        <w:ind w:left="720" w:hanging="0"/>
+        <w:jc w:val="both"/>
+        <w:rPr/>
+      </w:pPr>
+      <w:r>
+        <w:rPr>
+          <w:rFonts w:eastAsia="Courier New" w:cs="Courier New" w:ascii="Courier New" w:hAnsi="Courier New"/>
+          <w:color w:val="2B303B"/>
+          <w:sz w:val="18"/>
+          <w:szCs w:val="18"/>
+        </w:rPr>
+        <w:tab/>
+      </w:r>
+      <w:r>
+        <w:rPr>
+          <w:rFonts w:eastAsia="Courier New" w:cs="Courier New" w:ascii="Courier New" w:hAnsi="Courier New"/>
+          <w:color w:val="333333"/>
+          <w:sz w:val="18"/>
+          <w:szCs w:val="18"/>
+        </w:rPr>
+        <w:t xml:space="preserve"> -orst step7_</w:t>
+      </w:r>
+      <w:r>
+        <w:rPr>
+          <w:rFonts w:eastAsia="Courier New" w:cs="Courier New" w:ascii="Courier New" w:hAnsi="Courier New"/>
+          <w:color w:val="B34A00"/>
+          <w:sz w:val="18"/>
+          <w:szCs w:val="18"/>
+        </w:rPr>
+        <w:t>${cnt}</w:t>
+      </w:r>
+      <w:r>
+        <w:rPr>
+          <w:rFonts w:eastAsia="Courier New" w:cs="Courier New" w:ascii="Courier New" w:hAnsi="Courier New"/>
+          <w:color w:val="333333"/>
+          <w:sz w:val="18"/>
+          <w:szCs w:val="18"/>
+        </w:rPr>
+        <w:t xml:space="preserve">.rst </w:t>
+      </w:r>
+      <w:r>
+        <w:rPr>
+          <w:rFonts w:eastAsia="Courier New" w:cs="Courier New" w:ascii="Courier New" w:hAnsi="Courier New"/>
+          <w:color w:val="2B303B"/>
+          <w:sz w:val="18"/>
+          <w:szCs w:val="18"/>
+        </w:rPr>
+        <w:t>\</w:t>
+      </w:r>
+    </w:p>
+    <w:p>
+      <w:pPr>
+        <w:pStyle w:val="Normal"/>
+        <w:shd w:val="clear" w:fill="F4F4F4"/>
+        <w:spacing w:before="60" w:after="60"/>
+        <w:ind w:left="720" w:hanging="0"/>
+        <w:jc w:val="both"/>
+        <w:rPr/>
+      </w:pPr>
+      <w:r>
+        <w:rPr>
+          <w:rFonts w:eastAsia="Courier New" w:cs="Courier New" w:ascii="Courier New" w:hAnsi="Courier New"/>
+          <w:color w:val="2B303B"/>
+          <w:sz w:val="18"/>
+          <w:szCs w:val="18"/>
+        </w:rPr>
+        <w:tab/>
+      </w:r>
+      <w:r>
+        <w:rPr>
+          <w:rFonts w:eastAsia="Courier New" w:cs="Courier New" w:ascii="Courier New" w:hAnsi="Courier New"/>
+          <w:color w:val="333333"/>
+          <w:sz w:val="18"/>
+          <w:szCs w:val="18"/>
+        </w:rPr>
+        <w:t xml:space="preserve"> -odcd step7_</w:t>
+      </w:r>
+      <w:r>
+        <w:rPr>
+          <w:rFonts w:eastAsia="Courier New" w:cs="Courier New" w:ascii="Courier New" w:hAnsi="Courier New"/>
+          <w:color w:val="B34A00"/>
+          <w:sz w:val="18"/>
+          <w:szCs w:val="18"/>
+        </w:rPr>
+        <w:t>${cnt}</w:t>
+      </w:r>
+      <w:r>
+        <w:rPr>
+          <w:rFonts w:eastAsia="Courier New" w:cs="Courier New" w:ascii="Courier New" w:hAnsi="Courier New"/>
+          <w:color w:val="333333"/>
+          <w:sz w:val="18"/>
+          <w:szCs w:val="18"/>
+        </w:rPr>
+        <w:t xml:space="preserve">.dcd </w:t>
+      </w:r>
+      <w:r>
+        <w:rPr>
+          <w:rFonts w:eastAsia="Courier New" w:cs="Courier New" w:ascii="Courier New" w:hAnsi="Courier New"/>
+          <w:color w:val="14181F"/>
+          <w:sz w:val="18"/>
+          <w:szCs w:val="18"/>
+        </w:rPr>
+        <w:t>&gt;</w:t>
+      </w:r>
+      <w:r>
+        <w:rPr>
+          <w:rFonts w:eastAsia="Courier New" w:cs="Courier New" w:ascii="Courier New" w:hAnsi="Courier New"/>
+          <w:color w:val="333333"/>
+          <w:sz w:val="18"/>
+          <w:szCs w:val="18"/>
+        </w:rPr>
+        <w:t xml:space="preserve"> step7_</w:t>
+      </w:r>
+      <w:r>
+        <w:rPr>
+          <w:rFonts w:eastAsia="Courier New" w:cs="Courier New" w:ascii="Courier New" w:hAnsi="Courier New"/>
+          <w:color w:val="B34A00"/>
+          <w:sz w:val="18"/>
+          <w:szCs w:val="18"/>
+        </w:rPr>
+        <w:t>${cnt}</w:t>
+      </w:r>
+      <w:r>
+        <w:rPr>
+          <w:rFonts w:eastAsia="Courier New" w:cs="Courier New" w:ascii="Courier New" w:hAnsi="Courier New"/>
+          <w:color w:val="333333"/>
+          <w:sz w:val="18"/>
+          <w:szCs w:val="18"/>
+        </w:rPr>
+        <w:t>.out</w:t>
+      </w:r>
+    </w:p>
+    <w:p>
+      <w:pPr>
+        <w:pStyle w:val="Normal"/>
+        <w:shd w:val="clear" w:fill="F4F4F4"/>
+        <w:spacing w:before="60" w:after="60"/>
+        <w:ind w:left="720" w:hanging="0"/>
+        <w:jc w:val="both"/>
+        <w:rPr/>
+      </w:pPr>
+      <w:r>
+        <w:rPr>
+          <w:rFonts w:eastAsia="Courier New" w:cs="Courier New" w:ascii="Courier New" w:hAnsi="Courier New"/>
+          <w:color w:val="333333"/>
+          <w:sz w:val="18"/>
+          <w:szCs w:val="18"/>
+        </w:rPr>
+        <w:t xml:space="preserve">    </w:t>
+      </w:r>
+      <w:r>
+        <w:rPr>
+          <w:rFonts w:eastAsia="Courier New" w:cs="Courier New" w:ascii="Courier New" w:hAnsi="Courier New"/>
+          <w:color w:val="B34A00"/>
+          <w:sz w:val="18"/>
+          <w:szCs w:val="18"/>
+        </w:rPr>
+        <w:t>echo</w:t>
+      </w:r>
+      <w:r>
+        <w:rPr>
+          <w:rFonts w:eastAsia="Courier New" w:cs="Courier New" w:ascii="Courier New" w:hAnsi="Courier New"/>
+          <w:color w:val="333333"/>
+          <w:sz w:val="18"/>
+          <w:szCs w:val="18"/>
+        </w:rPr>
+        <w:t xml:space="preserve"> </w:t>
+      </w:r>
+      <w:r>
+        <w:rPr>
+          <w:rFonts w:eastAsia="Courier New" w:cs="Courier New" w:ascii="Courier New" w:hAnsi="Courier New"/>
+          <w:color w:val="008000"/>
+          <w:sz w:val="18"/>
+          <w:szCs w:val="18"/>
+        </w:rPr>
+        <w:t xml:space="preserve">"Segment </w:t>
+      </w:r>
+      <w:r>
+        <w:rPr>
+          <w:rFonts w:eastAsia="Courier New" w:cs="Courier New" w:ascii="Courier New" w:hAnsi="Courier New"/>
+          <w:color w:val="B34A00"/>
+          <w:sz w:val="18"/>
+          <w:szCs w:val="18"/>
+        </w:rPr>
+        <w:t>${cnt}</w:t>
+      </w:r>
+      <w:r>
+        <w:rPr>
+          <w:rFonts w:eastAsia="Courier New" w:cs="Courier New" w:ascii="Courier New" w:hAnsi="Courier New"/>
+          <w:color w:val="008000"/>
+          <w:sz w:val="18"/>
+          <w:szCs w:val="18"/>
+        </w:rPr>
+        <w:t xml:space="preserve"> done."</w:t>
+      </w:r>
+    </w:p>
+    <w:p>
+      <w:pPr>
+        <w:pStyle w:val="Normal"/>
+        <w:shd w:val="clear" w:fill="F4F4F4"/>
+        <w:spacing w:before="60" w:after="60"/>
+        <w:ind w:left="720" w:hanging="0"/>
+        <w:jc w:val="both"/>
+        <w:rPr/>
+      </w:pPr>
+      <w:r>
+        <w:rPr>
+          <w:rFonts w:eastAsia="Courier New" w:cs="Courier New" w:ascii="Courier New" w:hAnsi="Courier New"/>
+          <w:color w:val="8100C2"/>
+          <w:sz w:val="18"/>
+          <w:szCs w:val="18"/>
+        </w:rPr>
+        <w:t>done</w:t>
       </w:r>
     </w:p>
     <w:p>
@@ -1210,239 +2141,6 @@
           <w:szCs w:val="22"/>
         </w:rPr>
         <w:t>Each subsequent segment restarts from the previous .rst file:</w:t>
-      </w:r>
-    </w:p>
-    <w:p>
-      <w:pPr>
-        <w:pStyle w:val="Normal"/>
-        <w:shd w:val="clear" w:fill="F4F4F4"/>
-        <w:spacing w:before="60" w:after="60"/>
-        <w:ind w:left="720" w:hanging="0"/>
-        <w:jc w:val="both"/>
-        <w:rPr/>
-      </w:pPr>
-      <w:r>
-        <w:rPr>
-          <w:rFonts w:eastAsia="Courier New" w:cs="Courier New" w:ascii="Courier New" w:hAnsi="Courier New"/>
-          <w:color w:val="333333"/>
-          <w:sz w:val="18"/>
-          <w:szCs w:val="18"/>
-        </w:rPr>
-        <w:t>python -u openmm_run.py \</w:t>
-      </w:r>
-    </w:p>
-    <w:p>
-      <w:pPr>
-        <w:pStyle w:val="Normal"/>
-        <w:shd w:val="clear" w:fill="F4F4F4"/>
-        <w:spacing w:before="60" w:after="60"/>
-        <w:ind w:left="720" w:hanging="0"/>
-        <w:jc w:val="both"/>
-        <w:rPr/>
-      </w:pPr>
-      <w:r>
-        <w:rPr>
-          <w:rFonts w:eastAsia="Courier New" w:cs="Courier New" w:ascii="Courier New" w:hAnsi="Courier New"/>
-          <w:color w:val="333333"/>
-          <w:sz w:val="18"/>
-          <w:szCs w:val="18"/>
-        </w:rPr>
-        <w:t xml:space="preserve">  </w:t>
-      </w:r>
-      <w:r>
-        <w:rPr>
-          <w:rFonts w:eastAsia="Courier New" w:cs="Courier New" w:ascii="Courier New" w:hAnsi="Courier New"/>
-          <w:color w:val="333333"/>
-          <w:sz w:val="18"/>
-          <w:szCs w:val="18"/>
-        </w:rPr>
-        <w:t>-i step7_production.inp \</w:t>
-      </w:r>
-    </w:p>
-    <w:p>
-      <w:pPr>
-        <w:pStyle w:val="Normal"/>
-        <w:shd w:val="clear" w:fill="F4F4F4"/>
-        <w:spacing w:before="60" w:after="60"/>
-        <w:ind w:left="720" w:hanging="0"/>
-        <w:jc w:val="both"/>
-        <w:rPr/>
-      </w:pPr>
-      <w:r>
-        <w:rPr>
-          <w:rFonts w:eastAsia="Courier New" w:cs="Courier New" w:ascii="Courier New" w:hAnsi="Courier New"/>
-          <w:color w:val="333333"/>
-          <w:sz w:val="18"/>
-          <w:szCs w:val="18"/>
-        </w:rPr>
-        <w:t xml:space="preserve">  </w:t>
-      </w:r>
-      <w:r>
-        <w:rPr>
-          <w:rFonts w:eastAsia="Courier New" w:cs="Courier New" w:ascii="Courier New" w:hAnsi="Courier New"/>
-          <w:color w:val="333333"/>
-          <w:sz w:val="18"/>
-          <w:szCs w:val="18"/>
-        </w:rPr>
-        <w:t>-t toppar.str \</w:t>
-      </w:r>
-    </w:p>
-    <w:p>
-      <w:pPr>
-        <w:pStyle w:val="Normal"/>
-        <w:shd w:val="clear" w:fill="F4F4F4"/>
-        <w:spacing w:before="60" w:after="60"/>
-        <w:ind w:left="720" w:hanging="0"/>
-        <w:jc w:val="both"/>
-        <w:rPr/>
-      </w:pPr>
-      <w:r>
-        <w:rPr>
-          <w:rFonts w:eastAsia="Courier New" w:cs="Courier New" w:ascii="Courier New" w:hAnsi="Courier New"/>
-          <w:color w:val="333333"/>
-          <w:sz w:val="18"/>
-          <w:szCs w:val="18"/>
-        </w:rPr>
-        <w:t xml:space="preserve">  </w:t>
-      </w:r>
-      <w:r>
-        <w:rPr>
-          <w:rFonts w:eastAsia="Courier New" w:cs="Courier New" w:ascii="Courier New" w:hAnsi="Courier New"/>
-          <w:color w:val="333333"/>
-          <w:sz w:val="18"/>
-          <w:szCs w:val="18"/>
-        </w:rPr>
-        <w:t>-p step5_input.psf \</w:t>
-      </w:r>
-    </w:p>
-    <w:p>
-      <w:pPr>
-        <w:pStyle w:val="Normal"/>
-        <w:shd w:val="clear" w:fill="F4F4F4"/>
-        <w:spacing w:before="60" w:after="60"/>
-        <w:ind w:left="720" w:hanging="0"/>
-        <w:jc w:val="both"/>
-        <w:rPr/>
-      </w:pPr>
-      <w:r>
-        <w:rPr>
-          <w:rFonts w:eastAsia="Courier New" w:cs="Courier New" w:ascii="Courier New" w:hAnsi="Courier New"/>
-          <w:color w:val="333333"/>
-          <w:sz w:val="18"/>
-          <w:szCs w:val="18"/>
-        </w:rPr>
-        <w:t xml:space="preserve">  </w:t>
-      </w:r>
-      <w:r>
-        <w:rPr>
-          <w:rFonts w:eastAsia="Courier New" w:cs="Courier New" w:ascii="Courier New" w:hAnsi="Courier New"/>
-          <w:color w:val="333333"/>
-          <w:sz w:val="18"/>
-          <w:szCs w:val="18"/>
-        </w:rPr>
-        <w:t>-c step5_input.crd \</w:t>
-      </w:r>
-    </w:p>
-    <w:p>
-      <w:pPr>
-        <w:pStyle w:val="Normal"/>
-        <w:shd w:val="clear" w:fill="F4F4F4"/>
-        <w:spacing w:before="60" w:after="60"/>
-        <w:ind w:left="720" w:hanging="0"/>
-        <w:jc w:val="both"/>
-        <w:rPr/>
-      </w:pPr>
-      <w:r>
-        <w:rPr>
-          <w:rFonts w:eastAsia="Courier New" w:cs="Courier New" w:ascii="Courier New" w:hAnsi="Courier New"/>
-          <w:color w:val="333333"/>
-          <w:sz w:val="18"/>
-          <w:szCs w:val="18"/>
-        </w:rPr>
-        <w:t xml:space="preserve">  </w:t>
-      </w:r>
-      <w:r>
-        <w:rPr>
-          <w:rFonts w:eastAsia="Courier New" w:cs="Courier New" w:ascii="Courier New" w:hAnsi="Courier New"/>
-          <w:color w:val="333333"/>
-          <w:sz w:val="18"/>
-          <w:szCs w:val="18"/>
-        </w:rPr>
-        <w:t>-irst step7_1.rst \</w:t>
-      </w:r>
-    </w:p>
-    <w:p>
-      <w:pPr>
-        <w:pStyle w:val="Normal"/>
-        <w:shd w:val="clear" w:fill="F4F4F4"/>
-        <w:spacing w:before="60" w:after="60"/>
-        <w:ind w:left="720" w:hanging="0"/>
-        <w:jc w:val="both"/>
-        <w:rPr/>
-      </w:pPr>
-      <w:r>
-        <w:rPr>
-          <w:rFonts w:eastAsia="Courier New" w:cs="Courier New" w:ascii="Courier New" w:hAnsi="Courier New"/>
-          <w:color w:val="333333"/>
-          <w:sz w:val="18"/>
-          <w:szCs w:val="18"/>
-        </w:rPr>
-        <w:t xml:space="preserve">  </w:t>
-      </w:r>
-      <w:r>
-        <w:rPr>
-          <w:rFonts w:eastAsia="Courier New" w:cs="Courier New" w:ascii="Courier New" w:hAnsi="Courier New"/>
-          <w:color w:val="333333"/>
-          <w:sz w:val="18"/>
-          <w:szCs w:val="18"/>
-        </w:rPr>
-        <w:t>-orst step7_2.rst \</w:t>
-      </w:r>
-    </w:p>
-    <w:p>
-      <w:pPr>
-        <w:pStyle w:val="Normal"/>
-        <w:shd w:val="clear" w:fill="F4F4F4"/>
-        <w:spacing w:before="60" w:after="60"/>
-        <w:ind w:left="720" w:hanging="0"/>
-        <w:jc w:val="both"/>
-        <w:rPr/>
-      </w:pPr>
-      <w:r>
-        <w:rPr>
-          <w:rFonts w:eastAsia="Courier New" w:cs="Courier New" w:ascii="Courier New" w:hAnsi="Courier New"/>
-          <w:color w:val="333333"/>
-          <w:sz w:val="18"/>
-          <w:szCs w:val="18"/>
-        </w:rPr>
-        <w:t xml:space="preserve">  </w:t>
-      </w:r>
-      <w:r>
-        <w:rPr>
-          <w:rFonts w:eastAsia="Courier New" w:cs="Courier New" w:ascii="Courier New" w:hAnsi="Courier New"/>
-          <w:color w:val="333333"/>
-          <w:sz w:val="18"/>
-          <w:szCs w:val="18"/>
-        </w:rPr>
-        <w:t>-odcd step7_2.dcd &gt; step7_2.out</w:t>
-      </w:r>
-    </w:p>
-    <w:p>
-      <w:pPr>
-        <w:pStyle w:val="Normal"/>
-        <w:spacing w:before="80" w:after="80"/>
-        <w:jc w:val="both"/>
-        <w:rPr/>
-      </w:pPr>
-      <w:r>
-        <w:rPr>
-          <w:rFonts w:eastAsia="Arial" w:cs="Arial"/>
-          <w:b w:val="false"/>
-          <w:bCs w:val="false"/>
-          <w:sz w:val="22"/>
-          <w:szCs w:val="22"/>
-        </w:rPr>
-        <w:t>Repeat with incrementing numbers (step7_2.rst → step7_3.rst, etc.) until step7_10.dcd is complete.</w:t>
       </w:r>
     </w:p>
     <w:p>
@@ -1492,25 +2190,7 @@
         <w:sz w:val="16"/>
         <w:szCs w:val="16"/>
       </w:rPr>
-      <w:t xml:space="preserve">GUIDE </w:t>
-    </w:r>
-    <w:r>
-      <w:rPr>
-        <w:rFonts w:eastAsia="Arial" w:cs="Arial"/>
-        <w:color w:val="888888"/>
-        <w:sz w:val="16"/>
-        <w:szCs w:val="16"/>
-      </w:rPr>
-      <w:t>3</w:t>
-    </w:r>
-    <w:r>
-      <w:rPr>
-        <w:rFonts w:eastAsia="Arial" w:cs="Arial"/>
-        <w:color w:val="888888"/>
-        <w:sz w:val="16"/>
-        <w:szCs w:val="16"/>
-      </w:rPr>
-      <w:t xml:space="preserve"> — OpenMM MD Simulation | </w:t>
+      <w:t xml:space="preserve">GUIDE 3 — OpenMM MD Simulation | </w:t>
     </w:r>
     <w:r>
       <w:rPr/>
@@ -1565,6 +2245,7 @@
         </w:tabs>
         <w:ind w:left="1080" w:hanging="360"/>
       </w:pPr>
+      <w:rPr/>
     </w:lvl>
     <w:lvl w:ilvl="2">
       <w:start w:val="1"/>
@@ -1577,6 +2258,7 @@
         </w:tabs>
         <w:ind w:left="1440" w:hanging="360"/>
       </w:pPr>
+      <w:rPr/>
     </w:lvl>
     <w:lvl w:ilvl="3">
       <w:start w:val="1"/>
@@ -1589,6 +2271,7 @@
         </w:tabs>
         <w:ind w:left="1800" w:hanging="360"/>
       </w:pPr>
+      <w:rPr/>
     </w:lvl>
     <w:lvl w:ilvl="4">
       <w:start w:val="1"/>
@@ -1601,6 +2284,7 @@
         </w:tabs>
         <w:ind w:left="2160" w:hanging="360"/>
       </w:pPr>
+      <w:rPr/>
     </w:lvl>
     <w:lvl w:ilvl="5">
       <w:start w:val="1"/>
@@ -1613,6 +2297,7 @@
         </w:tabs>
         <w:ind w:left="2520" w:hanging="360"/>
       </w:pPr>
+      <w:rPr/>
     </w:lvl>
     <w:lvl w:ilvl="6">
       <w:start w:val="1"/>
@@ -1625,6 +2310,7 @@
         </w:tabs>
         <w:ind w:left="2880" w:hanging="360"/>
       </w:pPr>
+      <w:rPr/>
     </w:lvl>
     <w:lvl w:ilvl="7">
       <w:start w:val="1"/>
@@ -1637,6 +2323,7 @@
         </w:tabs>
         <w:ind w:left="3240" w:hanging="360"/>
       </w:pPr>
+      <w:rPr/>
     </w:lvl>
     <w:lvl w:ilvl="8">
       <w:start w:val="1"/>
@@ -1649,9 +2336,131 @@
         </w:tabs>
         <w:ind w:left="3600" w:hanging="360"/>
       </w:pPr>
+      <w:rPr/>
     </w:lvl>
   </w:abstractNum>
   <w:abstractNum w:abstractNumId="2">
+    <w:lvl w:ilvl="0">
+      <w:start w:val="1"/>
+      <w:numFmt w:val="bullet"/>
+      <w:lvlText w:val=""/>
+      <w:lvlJc w:val="left"/>
+      <w:pPr>
+        <w:tabs>
+          <w:tab w:val="num" w:pos="0"/>
+        </w:tabs>
+        <w:ind w:left="720" w:hanging="360"/>
+      </w:pPr>
+      <w:rPr>
+        <w:rFonts w:ascii="Symbol" w:hAnsi="Symbol" w:cs="Symbol" w:hint="default"/>
+      </w:rPr>
+    </w:lvl>
+    <w:lvl w:ilvl="1">
+      <w:start w:val="1"/>
+      <w:numFmt w:val="decimal"/>
+      <w:lvlText w:val="%2."/>
+      <w:lvlJc w:val="left"/>
+      <w:pPr>
+        <w:tabs>
+          <w:tab w:val="num" w:pos="1080"/>
+        </w:tabs>
+        <w:ind w:left="1080" w:hanging="360"/>
+      </w:pPr>
+      <w:rPr/>
+    </w:lvl>
+    <w:lvl w:ilvl="2">
+      <w:start w:val="1"/>
+      <w:numFmt w:val="decimal"/>
+      <w:lvlText w:val="%3."/>
+      <w:lvlJc w:val="left"/>
+      <w:pPr>
+        <w:tabs>
+          <w:tab w:val="num" w:pos="1440"/>
+        </w:tabs>
+        <w:ind w:left="1440" w:hanging="360"/>
+      </w:pPr>
+      <w:rPr/>
+    </w:lvl>
+    <w:lvl w:ilvl="3">
+      <w:start w:val="1"/>
+      <w:numFmt w:val="decimal"/>
+      <w:lvlText w:val="%4."/>
+      <w:lvlJc w:val="left"/>
+      <w:pPr>
+        <w:tabs>
+          <w:tab w:val="num" w:pos="1800"/>
+        </w:tabs>
+        <w:ind w:left="1800" w:hanging="360"/>
+      </w:pPr>
+      <w:rPr/>
+    </w:lvl>
+    <w:lvl w:ilvl="4">
+      <w:start w:val="1"/>
+      <w:numFmt w:val="decimal"/>
+      <w:lvlText w:val="%5."/>
+      <w:lvlJc w:val="left"/>
+      <w:pPr>
+        <w:tabs>
+          <w:tab w:val="num" w:pos="2160"/>
+        </w:tabs>
+        <w:ind w:left="2160" w:hanging="360"/>
+      </w:pPr>
+      <w:rPr/>
+    </w:lvl>
+    <w:lvl w:ilvl="5">
+      <w:start w:val="1"/>
+      <w:numFmt w:val="decimal"/>
+      <w:lvlText w:val="%6."/>
+      <w:lvlJc w:val="left"/>
+      <w:pPr>
+        <w:tabs>
+          <w:tab w:val="num" w:pos="2520"/>
+        </w:tabs>
+        <w:ind w:left="2520" w:hanging="360"/>
+      </w:pPr>
+      <w:rPr/>
+    </w:lvl>
+    <w:lvl w:ilvl="6">
+      <w:start w:val="1"/>
+      <w:numFmt w:val="decimal"/>
+      <w:lvlText w:val="%7."/>
+      <w:lvlJc w:val="left"/>
+      <w:pPr>
+        <w:tabs>
+          <w:tab w:val="num" w:pos="2880"/>
+        </w:tabs>
+        <w:ind w:left="2880" w:hanging="360"/>
+      </w:pPr>
+      <w:rPr/>
+    </w:lvl>
+    <w:lvl w:ilvl="7">
+      <w:start w:val="1"/>
+      <w:numFmt w:val="decimal"/>
+      <w:lvlText w:val="%8."/>
+      <w:lvlJc w:val="left"/>
+      <w:pPr>
+        <w:tabs>
+          <w:tab w:val="num" w:pos="3240"/>
+        </w:tabs>
+        <w:ind w:left="3240" w:hanging="360"/>
+      </w:pPr>
+      <w:rPr/>
+    </w:lvl>
+    <w:lvl w:ilvl="8">
+      <w:start w:val="1"/>
+      <w:numFmt w:val="decimal"/>
+      <w:lvlText w:val="%9."/>
+      <w:lvlJc w:val="left"/>
+      <w:pPr>
+        <w:tabs>
+          <w:tab w:val="num" w:pos="3600"/>
+        </w:tabs>
+        <w:ind w:left="3600" w:hanging="360"/>
+      </w:pPr>
+      <w:rPr/>
+    </w:lvl>
+  </w:abstractNum>
+  <w:abstractNum w:abstractNumId="3">
     <w:lvl w:ilvl="0">
       <w:start w:val="1"/>
       <w:numFmt w:val="none"/>
@@ -1777,10 +2586,19 @@
     <w:abstractNumId w:val="2"/>
   </w:num>
   <w:num w:numId="3">
-    <w:abstractNumId w:val="1"/>
+    <w:abstractNumId w:val="3"/>
+  </w:num>
+  <w:num w:numId="4">
+    <w:abstractNumId w:val="2"/>
     <w:lvlOverride w:ilvl="0">
       <w:startOverride w:val="1"/>
     </w:lvlOverride>
+  </w:num>
+  <w:num w:numId="5">
+    <w:abstractNumId w:val="2"/>
+  </w:num>
+  <w:num w:numId="6">
+    <w:abstractNumId w:val="2"/>
   </w:num>
 </w:numbering>
 </file>
@@ -1807,6 +2625,7 @@
     <w:qFormat/>
     <w:pPr>
       <w:widowControl/>
+      <w:suppressAutoHyphens w:val="true"/>
       <w:bidi w:val="0"/>
       <w:spacing w:before="0" w:after="0"/>
       <w:jc w:val="left"/>
@@ -2032,6 +2851,7 @@
     <w:qFormat/>
     <w:pPr>
       <w:widowControl/>
+      <w:suppressAutoHyphens w:val="true"/>
       <w:bidi w:val="0"/>
       <w:spacing w:before="0" w:after="0"/>
       <w:jc w:val="left"/>
@@ -2052,6 +2872,7 @@
     <w:qFormat/>
     <w:pPr>
       <w:widowControl/>
+      <w:suppressAutoHyphens w:val="true"/>
       <w:bidi w:val="0"/>
       <w:spacing w:before="0" w:after="0"/>
       <w:jc w:val="left"/>

</xml_diff>